<commit_message>
Finalize assembly: Word auto-TOC + PDF export
- assemble.py: replace plain-text TOC with a Word TOC field, set
  updateFields=true so the TOC populates when Word opens the doc, and
  suppress the source's cover-duplicate subtitle/prep lines on page 2
- After saving the .docx, drive Microsoft Word for Mac via AppleScript
  to refresh fields (populates the TOC with real page numbers), then
  export to PDF via Pages (Word AppleScript dictionary on this Mac
  rejects `save as PDF`; Pages handles export reliably)
- Output: FINAL_DOCUMENT.docx (60 KB, 82 styled headings) +
  FINAL_DOCUMENT.pdf (~340 KB, 22 pages); callout boxes, dark red accent,
  running header, and clickable TOC all preserved through export

Co-Authored-By: Claude Opus 4.7 (1M context) <noreply@anthropic.com>
</commit_message>
<xml_diff>
--- a/restoration_project/FINAL_DOCUMENT.docx
+++ b/restoration_project/FINAL_DOCUMENT.docx
@@ -98,20 +98,6 @@
     </w:p>
     <w:p>
       <w:pPr>
-        <w:spacing w:after="120" w:line="276" w:lineRule="auto"/>
-      </w:pPr>
-      <w:r>
-        <w:rPr>
-          <w:rFonts w:ascii="Times New Roman" w:hAnsi="Times New Roman" w:cs="Times New Roman"/>
-          <w:b w:val="0"/>
-          <w:i w:val="0"/>
-          <w:sz w:val="22"/>
-        </w:rPr>
-        <w:t>*Framework for Los Angeles County Operational Guidelines* Prepared by the URVI Guidelines Committee Los Angeles County Public Safety Agencies</w:t>
-      </w:r>
-    </w:p>
-    <w:p>
-      <w:pPr>
         <w:pStyle w:val="Heading2"/>
         <w:spacing w:before="240" w:after="120"/>
         <w:keepNext/>
@@ -132,1203 +118,26 @@
       </w:r>
     </w:p>
     <w:p>
-      <w:pPr>
-        <w:pStyle w:val="ListNumber"/>
-        <w:spacing w:after="60"/>
-      </w:pPr>
+      <w:r>
+        <w:fldChar w:fldCharType="begin" w:dirty="true"/>
+      </w:r>
+      <w:r>
+        <w:instrText xml:space="preserve"> TOC \o "1-3" \h \z \u </w:instrText>
+      </w:r>
+      <w:r>
+        <w:fldChar w:fldCharType="separate"/>
+      </w:r>
       <w:r>
         <w:rPr>
           <w:rFonts w:ascii="Times New Roman" w:hAnsi="Times New Roman" w:cs="Times New Roman"/>
           <w:b w:val="0"/>
-          <w:i w:val="0"/>
-          <w:sz w:val="22"/>
-        </w:rPr>
-        <w:t>EXECUTIVE SUMMARY — 3</w:t>
-      </w:r>
-    </w:p>
-    <w:p>
-      <w:pPr>
-        <w:pStyle w:val="ListBullet"/>
-        <w:spacing w:after="60"/>
-      </w:pPr>
-      <w:r>
-        <w:rPr>
-          <w:rFonts w:ascii="Times New Roman" w:hAnsi="Times New Roman" w:cs="Times New Roman"/>
-          <w:b w:val="0"/>
-          <w:i w:val="0"/>
-          <w:sz w:val="22"/>
-        </w:rPr>
-        <w:t>1.1 Preamble — 3</w:t>
-      </w:r>
-    </w:p>
-    <w:p>
-      <w:pPr>
-        <w:pStyle w:val="ListBullet"/>
-        <w:spacing w:after="60"/>
-      </w:pPr>
-      <w:r>
-        <w:rPr>
-          <w:rFonts w:ascii="Times New Roman" w:hAnsi="Times New Roman" w:cs="Times New Roman"/>
-          <w:b w:val="0"/>
-          <w:i w:val="0"/>
-          <w:sz w:val="22"/>
-        </w:rPr>
-        <w:t>1.2 Vision and Objectives — 3</w:t>
-      </w:r>
-    </w:p>
-    <w:p>
-      <w:pPr>
-        <w:pStyle w:val="ListBullet"/>
-        <w:spacing w:after="60"/>
-      </w:pPr>
-      <w:r>
-        <w:rPr>
-          <w:rFonts w:ascii="Times New Roman" w:hAnsi="Times New Roman" w:cs="Times New Roman"/>
-          <w:b w:val="0"/>
-          <w:i w:val="0"/>
-          <w:sz w:val="22"/>
-        </w:rPr>
-        <w:t>1.3 Target Audience — 3</w:t>
-      </w:r>
-    </w:p>
-    <w:p>
-      <w:pPr>
-        <w:pStyle w:val="ListBullet"/>
-        <w:spacing w:after="60"/>
-      </w:pPr>
-      <w:r>
-        <w:rPr>
-          <w:rFonts w:ascii="Times New Roman" w:hAnsi="Times New Roman" w:cs="Times New Roman"/>
-          <w:b w:val="0"/>
-          <w:i w:val="0"/>
-          <w:sz w:val="22"/>
-        </w:rPr>
-        <w:t>1.4 The Los Angeles County Operational Environment — 3</w:t>
-      </w:r>
-    </w:p>
-    <w:p>
-      <w:pPr>
-        <w:pStyle w:val="ListBullet"/>
-        <w:spacing w:after="60"/>
-      </w:pPr>
-      <w:r>
-        <w:rPr>
-          <w:rFonts w:ascii="Times New Roman" w:hAnsi="Times New Roman" w:cs="Times New Roman"/>
-          <w:b w:val="0"/>
-          <w:i w:val="0"/>
-          <w:sz w:val="22"/>
-        </w:rPr>
-        <w:t>1.5 Alignment with National Doctrine — 4</w:t>
-      </w:r>
-    </w:p>
-    <w:p>
-      <w:pPr>
-        <w:pStyle w:val="ListBullet"/>
-        <w:spacing w:after="60"/>
-      </w:pPr>
-      <w:r>
-        <w:rPr>
-          <w:rFonts w:ascii="Times New Roman" w:hAnsi="Times New Roman" w:cs="Times New Roman"/>
-          <w:b w:val="0"/>
-          <w:i w:val="0"/>
-          <w:sz w:val="22"/>
-        </w:rPr>
-        <w:t>1.6 Scope of Covered Incidents — 4</w:t>
-      </w:r>
-    </w:p>
-    <w:p>
-      <w:pPr>
-        <w:pStyle w:val="ListBullet"/>
-        <w:spacing w:after="60"/>
-      </w:pPr>
-      <w:r>
-        <w:rPr>
-          <w:rFonts w:ascii="Times New Roman" w:hAnsi="Times New Roman" w:cs="Times New Roman"/>
-          <w:b w:val="0"/>
-          <w:i w:val="0"/>
-          <w:sz w:val="22"/>
-        </w:rPr>
-        <w:t>1.7 Consequences of Breaking from Doctrine — 4</w:t>
-      </w:r>
-    </w:p>
-    <w:p>
-      <w:pPr>
-        <w:pStyle w:val="ListNumber"/>
-        <w:spacing w:after="60"/>
-      </w:pPr>
-      <w:r>
-        <w:rPr>
-          <w:rFonts w:ascii="Times New Roman" w:hAnsi="Times New Roman" w:cs="Times New Roman"/>
-          <w:b w:val="0"/>
-          <w:i w:val="0"/>
-          <w:sz w:val="22"/>
-        </w:rPr>
-        <w:t>NATIONAL DOCTRINE FOUNDATION — 4</w:t>
-      </w:r>
-    </w:p>
-    <w:p>
-      <w:pPr>
-        <w:pStyle w:val="ListBullet"/>
-        <w:spacing w:after="60"/>
-      </w:pPr>
-      <w:r>
-        <w:rPr>
-          <w:rFonts w:ascii="Times New Roman" w:hAnsi="Times New Roman" w:cs="Times New Roman"/>
-          <w:b w:val="0"/>
-          <w:i w:val="0"/>
-          <w:sz w:val="22"/>
-        </w:rPr>
-        <w:t>2.1 Core NIMS Principles — 4</w:t>
-      </w:r>
-    </w:p>
-    <w:p>
-      <w:pPr>
-        <w:pStyle w:val="ListBullet"/>
-        <w:spacing w:after="60"/>
-      </w:pPr>
-      <w:r>
-        <w:rPr>
-          <w:rFonts w:ascii="Times New Roman" w:hAnsi="Times New Roman" w:cs="Times New Roman"/>
-          <w:b w:val="0"/>
-          <w:i w:val="0"/>
-          <w:sz w:val="22"/>
-        </w:rPr>
-        <w:t>2.2 NFPA 3000 as a Guiding Standard — 4</w:t>
-      </w:r>
-    </w:p>
-    <w:p>
-      <w:pPr>
-        <w:pStyle w:val="ListNumber"/>
-        <w:spacing w:after="60"/>
-      </w:pPr>
-      <w:r>
-        <w:rPr>
-          <w:rFonts w:ascii="Times New Roman" w:hAnsi="Times New Roman" w:cs="Times New Roman"/>
-          <w:b w:val="0"/>
-          <w:i w:val="0"/>
-          <w:sz w:val="22"/>
-        </w:rPr>
-        <w:t>INCIDENT TYPES: DYNAMIC VS. STATIC SCENARIOS — 5</w:t>
-      </w:r>
-    </w:p>
-    <w:p>
-      <w:pPr>
-        <w:pStyle w:val="ListBullet"/>
-        <w:spacing w:after="60"/>
-      </w:pPr>
-      <w:r>
-        <w:rPr>
-          <w:rFonts w:ascii="Times New Roman" w:hAnsi="Times New Roman" w:cs="Times New Roman"/>
-          <w:b w:val="0"/>
-          <w:i w:val="0"/>
-          <w:sz w:val="22"/>
-        </w:rPr>
-        <w:t>3.1 Dynamic Incidents — 5</w:t>
-      </w:r>
-    </w:p>
-    <w:p>
-      <w:pPr>
-        <w:pStyle w:val="ListBullet"/>
-        <w:spacing w:after="60"/>
-      </w:pPr>
-      <w:r>
-        <w:rPr>
-          <w:rFonts w:ascii="Times New Roman" w:hAnsi="Times New Roman" w:cs="Times New Roman"/>
-          <w:b w:val="0"/>
-          <w:i w:val="0"/>
-          <w:sz w:val="22"/>
-        </w:rPr>
-        <w:t>3.2 Static or Contained Incidents — 5</w:t>
-      </w:r>
-    </w:p>
-    <w:p>
-      <w:pPr>
-        <w:pStyle w:val="ListBullet"/>
-        <w:spacing w:after="60"/>
-      </w:pPr>
-      <w:r>
-        <w:rPr>
-          <w:rFonts w:ascii="Times New Roman" w:hAnsi="Times New Roman" w:cs="Times New Roman"/>
-          <w:b w:val="0"/>
-          <w:i w:val="0"/>
-          <w:sz w:val="22"/>
-        </w:rPr>
-        <w:t>3.3 Transitioning Between Types — 5</w:t>
-      </w:r>
-    </w:p>
-    <w:p>
-      <w:pPr>
-        <w:pStyle w:val="ListNumber"/>
-        <w:spacing w:after="60"/>
-      </w:pPr>
-      <w:r>
-        <w:rPr>
-          <w:rFonts w:ascii="Times New Roman" w:hAnsi="Times New Roman" w:cs="Times New Roman"/>
-          <w:b w:val="0"/>
-          <w:i w:val="0"/>
-          <w:sz w:val="22"/>
-        </w:rPr>
-        <w:t>THREE-PHASE RESPONSE MODEL — 5</w:t>
-      </w:r>
-    </w:p>
-    <w:p>
-      <w:pPr>
-        <w:pStyle w:val="ListBullet"/>
-        <w:spacing w:after="60"/>
-      </w:pPr>
-      <w:r>
-        <w:rPr>
-          <w:rFonts w:ascii="Times New Roman" w:hAnsi="Times New Roman" w:cs="Times New Roman"/>
-          <w:b w:val="0"/>
-          <w:i w:val="0"/>
-          <w:sz w:val="22"/>
-        </w:rPr>
-        <w:t>4.1 Phase 1 – Stop the Killing — 6</w:t>
-      </w:r>
-    </w:p>
-    <w:p>
-      <w:pPr>
-        <w:pStyle w:val="ListBullet"/>
-        <w:spacing w:after="60"/>
-      </w:pPr>
-      <w:r>
-        <w:rPr>
-          <w:rFonts w:ascii="Times New Roman" w:hAnsi="Times New Roman" w:cs="Times New Roman"/>
-          <w:b w:val="0"/>
-          <w:i w:val="0"/>
-          <w:sz w:val="22"/>
-        </w:rPr>
-        <w:t>4.1.1 Law Enforcement Priorities — 6</w:t>
-      </w:r>
-    </w:p>
-    <w:p>
-      <w:pPr>
-        <w:pStyle w:val="ListBullet"/>
-        <w:spacing w:after="60"/>
-      </w:pPr>
-      <w:r>
-        <w:rPr>
-          <w:rFonts w:ascii="Times New Roman" w:hAnsi="Times New Roman" w:cs="Times New Roman"/>
-          <w:b w:val="0"/>
-          <w:i w:val="0"/>
-          <w:sz w:val="22"/>
-        </w:rPr>
-        <w:t>4.1.2 Solo Officer Engagement — 6</w:t>
-      </w:r>
-    </w:p>
-    <w:p>
-      <w:pPr>
-        <w:pStyle w:val="ListBullet"/>
-        <w:spacing w:after="60"/>
-      </w:pPr>
-      <w:r>
-        <w:rPr>
-          <w:rFonts w:ascii="Times New Roman" w:hAnsi="Times New Roman" w:cs="Times New Roman"/>
-          <w:b w:val="0"/>
-          <w:i w:val="0"/>
-          <w:sz w:val="22"/>
-        </w:rPr>
-        <w:t>4.1.3 Contact Team Deployment — 6</w:t>
-      </w:r>
-    </w:p>
-    <w:p>
-      <w:pPr>
-        <w:pStyle w:val="ListBullet"/>
-        <w:spacing w:after="60"/>
-      </w:pPr>
-      <w:r>
-        <w:rPr>
-          <w:rFonts w:ascii="Times New Roman" w:hAnsi="Times New Roman" w:cs="Times New Roman"/>
-          <w:b w:val="0"/>
-          <w:i w:val="0"/>
-          <w:sz w:val="22"/>
-        </w:rPr>
-        <w:t>4.1.4 Maintaining Command During Tactical Entry — 6</w:t>
-      </w:r>
-    </w:p>
-    <w:p>
-      <w:pPr>
-        <w:pStyle w:val="ListBullet"/>
-        <w:spacing w:after="60"/>
-      </w:pPr>
-      <w:r>
-        <w:rPr>
-          <w:rFonts w:ascii="Times New Roman" w:hAnsi="Times New Roman" w:cs="Times New Roman"/>
-          <w:b w:val="0"/>
-          <w:i w:val="0"/>
-          <w:sz w:val="22"/>
-        </w:rPr>
-        <w:t>4.1.5 Supervisor Responsibilities — 7</w:t>
-      </w:r>
-    </w:p>
-    <w:p>
-      <w:pPr>
-        <w:pStyle w:val="ListBullet"/>
-        <w:spacing w:after="60"/>
-      </w:pPr>
-      <w:r>
-        <w:rPr>
-          <w:rFonts w:ascii="Times New Roman" w:hAnsi="Times New Roman" w:cs="Times New Roman"/>
-          <w:b w:val="0"/>
-          <w:i w:val="0"/>
-          <w:sz w:val="22"/>
-        </w:rPr>
-        <w:t>4.2 Phase 2 – Stop the Dying — 7</w:t>
-      </w:r>
-    </w:p>
-    <w:p>
-      <w:pPr>
-        <w:pStyle w:val="ListBullet"/>
-        <w:spacing w:after="60"/>
-      </w:pPr>
-      <w:r>
-        <w:rPr>
-          <w:rFonts w:ascii="Times New Roman" w:hAnsi="Times New Roman" w:cs="Times New Roman"/>
-          <w:b w:val="0"/>
-          <w:i w:val="0"/>
-          <w:sz w:val="22"/>
-        </w:rPr>
-        <w:t>4.2.1 Considerations for RTF Deployment — 7</w:t>
-      </w:r>
-    </w:p>
-    <w:p>
-      <w:pPr>
-        <w:pStyle w:val="ListBullet"/>
-        <w:spacing w:after="60"/>
-      </w:pPr>
-      <w:r>
-        <w:rPr>
-          <w:rFonts w:ascii="Times New Roman" w:hAnsi="Times New Roman" w:cs="Times New Roman"/>
-          <w:b w:val="0"/>
-          <w:i w:val="0"/>
-          <w:sz w:val="22"/>
-        </w:rPr>
-        <w:t>4.2.2 Operational Zone Definitions — 7</w:t>
-      </w:r>
-    </w:p>
-    <w:p>
-      <w:pPr>
-        <w:pStyle w:val="ListBullet"/>
-        <w:spacing w:after="60"/>
-      </w:pPr>
-      <w:r>
-        <w:rPr>
-          <w:rFonts w:ascii="Times New Roman" w:hAnsi="Times New Roman" w:cs="Times New Roman"/>
-          <w:b w:val="0"/>
-          <w:i w:val="0"/>
-          <w:sz w:val="22"/>
-        </w:rPr>
-        <w:t>4.2.3 RTF Functions — 7</w:t>
-      </w:r>
-    </w:p>
-    <w:p>
-      <w:pPr>
-        <w:pStyle w:val="ListBullet"/>
-        <w:spacing w:after="60"/>
-      </w:pPr>
-      <w:r>
-        <w:rPr>
-          <w:rFonts w:ascii="Times New Roman" w:hAnsi="Times New Roman" w:cs="Times New Roman"/>
-          <w:b w:val="0"/>
-          <w:i w:val="0"/>
-          <w:sz w:val="22"/>
-        </w:rPr>
-        <w:t>4.2.4 Tactical Emergency Medical Priorities — 8</w:t>
-      </w:r>
-    </w:p>
-    <w:p>
-      <w:pPr>
-        <w:pStyle w:val="ListBullet"/>
-        <w:spacing w:after="60"/>
-      </w:pPr>
-      <w:r>
-        <w:rPr>
-          <w:rFonts w:ascii="Times New Roman" w:hAnsi="Times New Roman" w:cs="Times New Roman"/>
-          <w:b w:val="0"/>
-          <w:i w:val="0"/>
-          <w:sz w:val="22"/>
-        </w:rPr>
-        <w:t>4.2.5 Coordinating Medical and Security Operations — 8</w:t>
-      </w:r>
-    </w:p>
-    <w:p>
-      <w:pPr>
-        <w:pStyle w:val="ListBullet"/>
-        <w:spacing w:after="60"/>
-      </w:pPr>
-      <w:r>
-        <w:rPr>
-          <w:rFonts w:ascii="Times New Roman" w:hAnsi="Times New Roman" w:cs="Times New Roman"/>
-          <w:b w:val="0"/>
-          <w:i w:val="0"/>
-          <w:sz w:val="22"/>
-        </w:rPr>
-        <w:t>4.3 Phase 3 – Recovery and Transition — 8</w:t>
-      </w:r>
-    </w:p>
-    <w:p>
-      <w:pPr>
-        <w:pStyle w:val="ListBullet"/>
-        <w:spacing w:after="60"/>
-      </w:pPr>
-      <w:r>
-        <w:rPr>
-          <w:rFonts w:ascii="Times New Roman" w:hAnsi="Times New Roman" w:cs="Times New Roman"/>
-          <w:b w:val="0"/>
-          <w:i w:val="0"/>
-          <w:sz w:val="22"/>
-        </w:rPr>
-        <w:t>4.3.1 Command Priorities — 8</w:t>
-      </w:r>
-    </w:p>
-    <w:p>
-      <w:pPr>
-        <w:pStyle w:val="ListNumber"/>
-        <w:spacing w:after="60"/>
-      </w:pPr>
-      <w:r>
-        <w:rPr>
-          <w:rFonts w:ascii="Times New Roman" w:hAnsi="Times New Roman" w:cs="Times New Roman"/>
-          <w:b w:val="0"/>
-          <w:i w:val="0"/>
-          <w:sz w:val="22"/>
-        </w:rPr>
-        <w:t>COMMAND PROCEDURES — 9</w:t>
-      </w:r>
-    </w:p>
-    <w:p>
-      <w:pPr>
-        <w:pStyle w:val="ListBullet"/>
-        <w:spacing w:after="60"/>
-      </w:pPr>
-      <w:r>
-        <w:rPr>
-          <w:rFonts w:ascii="Times New Roman" w:hAnsi="Times New Roman" w:cs="Times New Roman"/>
-          <w:b w:val="0"/>
-          <w:i w:val="0"/>
-          <w:sz w:val="22"/>
-        </w:rPr>
-        <w:t>5.1 First Officer on Scene — 9</w:t>
-      </w:r>
-    </w:p>
-    <w:p>
-      <w:pPr>
-        <w:pStyle w:val="ListBullet"/>
-        <w:spacing w:after="60"/>
-      </w:pPr>
-      <w:r>
-        <w:rPr>
-          <w:rFonts w:ascii="Times New Roman" w:hAnsi="Times New Roman" w:cs="Times New Roman"/>
-          <w:b w:val="0"/>
-          <w:i w:val="0"/>
-          <w:sz w:val="22"/>
-        </w:rPr>
-        <w:t>5.1.1 Responsibilities — 9</w:t>
-      </w:r>
-    </w:p>
-    <w:p>
-      <w:pPr>
-        <w:pStyle w:val="ListBullet"/>
-        <w:spacing w:after="60"/>
-      </w:pPr>
-      <w:r>
-        <w:rPr>
-          <w:rFonts w:ascii="Times New Roman" w:hAnsi="Times New Roman" w:cs="Times New Roman"/>
-          <w:b w:val="0"/>
-          <w:i w:val="0"/>
-          <w:sz w:val="22"/>
-        </w:rPr>
-        <w:t>5.1.2 Initial Radio Communication — 9</w:t>
-      </w:r>
-    </w:p>
-    <w:p>
-      <w:pPr>
-        <w:pStyle w:val="ListBullet"/>
-        <w:spacing w:after="60"/>
-      </w:pPr>
-      <w:r>
-        <w:rPr>
-          <w:rFonts w:ascii="Times New Roman" w:hAnsi="Times New Roman" w:cs="Times New Roman"/>
-          <w:b w:val="0"/>
-          <w:i w:val="0"/>
-          <w:sz w:val="22"/>
-        </w:rPr>
-        <w:t>5.2 Mobile Command — 9</w:t>
-      </w:r>
-    </w:p>
-    <w:p>
-      <w:pPr>
-        <w:pStyle w:val="ListBullet"/>
-        <w:spacing w:after="60"/>
-      </w:pPr>
-      <w:r>
-        <w:rPr>
-          <w:rFonts w:ascii="Times New Roman" w:hAnsi="Times New Roman" w:cs="Times New Roman"/>
-          <w:b w:val="0"/>
-          <w:i w:val="0"/>
-          <w:sz w:val="22"/>
-        </w:rPr>
-        <w:t>5.3 Role of Second Supervisor — 9</w:t>
-      </w:r>
-    </w:p>
-    <w:p>
-      <w:pPr>
-        <w:pStyle w:val="ListBullet"/>
-        <w:spacing w:after="60"/>
-      </w:pPr>
-      <w:r>
-        <w:rPr>
-          <w:rFonts w:ascii="Times New Roman" w:hAnsi="Times New Roman" w:cs="Times New Roman"/>
-          <w:b w:val="0"/>
-          <w:i w:val="0"/>
-          <w:sz w:val="22"/>
-        </w:rPr>
-        <w:t>5.4 Transfer of Command — 9</w:t>
-      </w:r>
-    </w:p>
-    <w:p>
-      <w:pPr>
-        <w:pStyle w:val="ListBullet"/>
-        <w:spacing w:after="60"/>
-      </w:pPr>
-      <w:r>
-        <w:rPr>
-          <w:rFonts w:ascii="Times New Roman" w:hAnsi="Times New Roman" w:cs="Times New Roman"/>
-          <w:b w:val="0"/>
-          <w:i w:val="0"/>
-          <w:sz w:val="22"/>
-        </w:rPr>
-        <w:t>5.5 Transition from Mobile to Fixed Command Post — 10</w:t>
-      </w:r>
-    </w:p>
-    <w:p>
-      <w:pPr>
-        <w:pStyle w:val="ListNumber"/>
-        <w:spacing w:after="60"/>
-      </w:pPr>
-      <w:r>
-        <w:rPr>
-          <w:rFonts w:ascii="Times New Roman" w:hAnsi="Times New Roman" w:cs="Times New Roman"/>
-          <w:b w:val="0"/>
-          <w:i w:val="0"/>
-          <w:sz w:val="22"/>
-        </w:rPr>
-        <w:t>UNIFIED COMMAND — 10</w:t>
-      </w:r>
-    </w:p>
-    <w:p>
-      <w:pPr>
-        <w:pStyle w:val="ListBullet"/>
-        <w:spacing w:after="60"/>
-      </w:pPr>
-      <w:r>
-        <w:rPr>
-          <w:rFonts w:ascii="Times New Roman" w:hAnsi="Times New Roman" w:cs="Times New Roman"/>
-          <w:b w:val="0"/>
-          <w:i w:val="0"/>
-          <w:sz w:val="22"/>
-        </w:rPr>
-        <w:t>6.1 Purpose and Importance — 10</w:t>
-      </w:r>
-    </w:p>
-    <w:p>
-      <w:pPr>
-        <w:pStyle w:val="ListBullet"/>
-        <w:spacing w:after="60"/>
-      </w:pPr>
-      <w:r>
-        <w:rPr>
-          <w:rFonts w:ascii="Times New Roman" w:hAnsi="Times New Roman" w:cs="Times New Roman"/>
-          <w:b w:val="0"/>
-          <w:i w:val="0"/>
-          <w:sz w:val="22"/>
-        </w:rPr>
-        <w:t>6.2 Triggers for Formation — 10</w:t>
-      </w:r>
-    </w:p>
-    <w:p>
-      <w:pPr>
-        <w:pStyle w:val="ListBullet"/>
-        <w:spacing w:after="60"/>
-      </w:pPr>
-      <w:r>
-        <w:rPr>
-          <w:rFonts w:ascii="Times New Roman" w:hAnsi="Times New Roman" w:cs="Times New Roman"/>
-          <w:b w:val="0"/>
-          <w:i w:val="0"/>
-          <w:sz w:val="22"/>
-        </w:rPr>
-        <w:t>6.3 Unified Command Responsibilities — 10</w:t>
-      </w:r>
-    </w:p>
-    <w:p>
-      <w:pPr>
-        <w:pStyle w:val="ListBullet"/>
-        <w:spacing w:after="60"/>
-      </w:pPr>
-      <w:r>
-        <w:rPr>
-          <w:rFonts w:ascii="Times New Roman" w:hAnsi="Times New Roman" w:cs="Times New Roman"/>
-          <w:b w:val="0"/>
-          <w:i w:val="0"/>
-          <w:sz w:val="22"/>
-        </w:rPr>
-        <w:t>6.4 Command Post Setup — 10</w:t>
-      </w:r>
-    </w:p>
-    <w:p>
-      <w:pPr>
-        <w:pStyle w:val="ListBullet"/>
-        <w:spacing w:after="60"/>
-      </w:pPr>
-      <w:r>
-        <w:rPr>
-          <w:rFonts w:ascii="Times New Roman" w:hAnsi="Times New Roman" w:cs="Times New Roman"/>
-          <w:b w:val="0"/>
-          <w:i w:val="0"/>
-          <w:sz w:val="22"/>
-        </w:rPr>
-        <w:t>6.5 Communication Protocols — 10</w:t>
-      </w:r>
-    </w:p>
-    <w:p>
-      <w:pPr>
-        <w:pStyle w:val="ListBullet"/>
-        <w:spacing w:after="60"/>
-      </w:pPr>
-      <w:r>
-        <w:rPr>
-          <w:rFonts w:ascii="Times New Roman" w:hAnsi="Times New Roman" w:cs="Times New Roman"/>
-          <w:b w:val="0"/>
-          <w:i w:val="0"/>
-          <w:sz w:val="22"/>
-        </w:rPr>
-        <w:t>6.6 Preventing Conflict in Multi-Agency Command — 11</w:t>
-      </w:r>
-    </w:p>
-    <w:p>
-      <w:pPr>
-        <w:pStyle w:val="ListNumber"/>
-        <w:spacing w:after="60"/>
-      </w:pPr>
-      <w:r>
-        <w:rPr>
-          <w:rFonts w:ascii="Times New Roman" w:hAnsi="Times New Roman" w:cs="Times New Roman"/>
-          <w:b w:val="0"/>
-          <w:i w:val="0"/>
-          <w:sz w:val="22"/>
-        </w:rPr>
-        <w:t>RESCUE TASK FORCES (RTFS) — 11</w:t>
-      </w:r>
-    </w:p>
-    <w:p>
-      <w:pPr>
-        <w:pStyle w:val="ListBullet"/>
-        <w:spacing w:after="60"/>
-      </w:pPr>
-      <w:r>
-        <w:rPr>
-          <w:rFonts w:ascii="Times New Roman" w:hAnsi="Times New Roman" w:cs="Times New Roman"/>
-          <w:b w:val="0"/>
-          <w:i w:val="0"/>
-          <w:sz w:val="22"/>
-        </w:rPr>
-        <w:t>7.1 Definition and Composition — 11</w:t>
-      </w:r>
-    </w:p>
-    <w:p>
-      <w:pPr>
-        <w:pStyle w:val="ListBullet"/>
-        <w:spacing w:after="60"/>
-      </w:pPr>
-      <w:r>
-        <w:rPr>
-          <w:rFonts w:ascii="Times New Roman" w:hAnsi="Times New Roman" w:cs="Times New Roman"/>
-          <w:b w:val="0"/>
-          <w:i w:val="0"/>
-          <w:sz w:val="22"/>
-        </w:rPr>
-        <w:t>7.2 RTF Formation — 11</w:t>
-      </w:r>
-    </w:p>
-    <w:p>
-      <w:pPr>
-        <w:pStyle w:val="ListBullet"/>
-        <w:spacing w:after="60"/>
-      </w:pPr>
-      <w:r>
-        <w:rPr>
-          <w:rFonts w:ascii="Times New Roman" w:hAnsi="Times New Roman" w:cs="Times New Roman"/>
-          <w:b w:val="0"/>
-          <w:i w:val="0"/>
-          <w:sz w:val="22"/>
-        </w:rPr>
-        <w:t>7.3 Roles Within the RTF — 11</w:t>
-      </w:r>
-    </w:p>
-    <w:p>
-      <w:pPr>
-        <w:pStyle w:val="ListBullet"/>
-        <w:spacing w:after="60"/>
-      </w:pPr>
-      <w:r>
-        <w:rPr>
-          <w:rFonts w:ascii="Times New Roman" w:hAnsi="Times New Roman" w:cs="Times New Roman"/>
-          <w:b w:val="0"/>
-          <w:i w:val="0"/>
-          <w:sz w:val="22"/>
-        </w:rPr>
-        <w:t>7.4 Deployment Triggers and Priorities — 11</w:t>
-      </w:r>
-    </w:p>
-    <w:p>
-      <w:pPr>
-        <w:pStyle w:val="ListBullet"/>
-        <w:spacing w:after="60"/>
-      </w:pPr>
-      <w:r>
-        <w:rPr>
-          <w:rFonts w:ascii="Times New Roman" w:hAnsi="Times New Roman" w:cs="Times New Roman"/>
-          <w:b w:val="0"/>
-          <w:i w:val="0"/>
-          <w:sz w:val="22"/>
-        </w:rPr>
-        <w:t>7.5 Operational Cohesion — 12</w:t>
-      </w:r>
-    </w:p>
-    <w:p>
-      <w:pPr>
-        <w:pStyle w:val="ListBullet"/>
-        <w:spacing w:after="60"/>
-      </w:pPr>
-      <w:r>
-        <w:rPr>
-          <w:rFonts w:ascii="Times New Roman" w:hAnsi="Times New Roman" w:cs="Times New Roman"/>
-          <w:b w:val="0"/>
-          <w:i w:val="0"/>
-          <w:sz w:val="22"/>
-        </w:rPr>
-        <w:t>7.6 RTF-to-Command Communication — 12</w:t>
-      </w:r>
-    </w:p>
-    <w:p>
-      <w:pPr>
-        <w:pStyle w:val="ListBullet"/>
-        <w:spacing w:after="60"/>
-      </w:pPr>
-      <w:r>
-        <w:rPr>
-          <w:rFonts w:ascii="Times New Roman" w:hAnsi="Times New Roman" w:cs="Times New Roman"/>
-          <w:b w:val="0"/>
-          <w:i w:val="0"/>
-          <w:sz w:val="22"/>
-        </w:rPr>
-        <w:t>7.7 Withdrawal Criteria — 12</w:t>
-      </w:r>
-    </w:p>
-    <w:p>
-      <w:pPr>
-        <w:pStyle w:val="ListBullet"/>
-        <w:spacing w:after="60"/>
-      </w:pPr>
-      <w:r>
-        <w:rPr>
-          <w:rFonts w:ascii="Times New Roman" w:hAnsi="Times New Roman" w:cs="Times New Roman"/>
-          <w:b w:val="0"/>
-          <w:i w:val="0"/>
-          <w:sz w:val="22"/>
-        </w:rPr>
-        <w:t>7.8 Multiple RTF Oversight — 12</w:t>
-      </w:r>
-    </w:p>
-    <w:p>
-      <w:pPr>
-        <w:pStyle w:val="ListNumber"/>
-        <w:spacing w:after="60"/>
-      </w:pPr>
-      <w:r>
-        <w:rPr>
-          <w:rFonts w:ascii="Times New Roman" w:hAnsi="Times New Roman" w:cs="Times New Roman"/>
-          <w:b w:val="0"/>
-          <w:i w:val="0"/>
-          <w:sz w:val="22"/>
-        </w:rPr>
-        <w:t>COMMUNICATIONS AND INTEROPERABILITY — 12</w:t>
-      </w:r>
-    </w:p>
-    <w:p>
-      <w:pPr>
-        <w:pStyle w:val="ListBullet"/>
-        <w:spacing w:after="60"/>
-      </w:pPr>
-      <w:r>
-        <w:rPr>
-          <w:rFonts w:ascii="Times New Roman" w:hAnsi="Times New Roman" w:cs="Times New Roman"/>
-          <w:b w:val="0"/>
-          <w:i w:val="0"/>
-          <w:sz w:val="22"/>
-        </w:rPr>
-        <w:t>8.1 Communications Principles — 12</w:t>
-      </w:r>
-    </w:p>
-    <w:p>
-      <w:pPr>
-        <w:pStyle w:val="ListBullet"/>
-        <w:spacing w:after="60"/>
-      </w:pPr>
-      <w:r>
-        <w:rPr>
-          <w:rFonts w:ascii="Times New Roman" w:hAnsi="Times New Roman" w:cs="Times New Roman"/>
-          <w:b w:val="0"/>
-          <w:i w:val="0"/>
-          <w:sz w:val="22"/>
-        </w:rPr>
-        <w:t>8.2 Radio Channel Architecture — 12</w:t>
-      </w:r>
-    </w:p>
-    <w:p>
-      <w:pPr>
-        <w:pStyle w:val="ListBullet"/>
-        <w:spacing w:after="60"/>
-      </w:pPr>
-      <w:r>
-        <w:rPr>
-          <w:rFonts w:ascii="Times New Roman" w:hAnsi="Times New Roman" w:cs="Times New Roman"/>
-          <w:b w:val="0"/>
-          <w:i w:val="0"/>
-          <w:sz w:val="22"/>
-        </w:rPr>
-        <w:t>8.3 Not All Agencies Can Communicate Directly — 12</w:t>
-      </w:r>
-    </w:p>
-    <w:p>
-      <w:pPr>
-        <w:pStyle w:val="ListBullet"/>
-        <w:spacing w:after="60"/>
-      </w:pPr>
-      <w:r>
-        <w:rPr>
-          <w:rFonts w:ascii="Times New Roman" w:hAnsi="Times New Roman" w:cs="Times New Roman"/>
-          <w:b w:val="0"/>
-          <w:i w:val="0"/>
-          <w:sz w:val="22"/>
-        </w:rPr>
-        <w:t>8.4 Information Flow During Operations — 13</w:t>
-      </w:r>
-    </w:p>
-    <w:p>
-      <w:pPr>
-        <w:pStyle w:val="ListBullet"/>
-        <w:spacing w:after="60"/>
-      </w:pPr>
-      <w:r>
-        <w:rPr>
-          <w:rFonts w:ascii="Times New Roman" w:hAnsi="Times New Roman" w:cs="Times New Roman"/>
-          <w:b w:val="0"/>
-          <w:i w:val="0"/>
-          <w:sz w:val="22"/>
-        </w:rPr>
-        <w:t>8.5 Subsequent Control Measures — 13</w:t>
-      </w:r>
-    </w:p>
-    <w:p>
-      <w:pPr>
-        <w:pStyle w:val="ListNumber"/>
-        <w:spacing w:after="60"/>
-      </w:pPr>
-      <w:r>
-        <w:rPr>
-          <w:rFonts w:ascii="Times New Roman" w:hAnsi="Times New Roman" w:cs="Times New Roman"/>
-          <w:b w:val="0"/>
-          <w:i w:val="0"/>
-          <w:sz w:val="22"/>
-        </w:rPr>
-        <w:t>TRAINING AND PREPAREDNESS — 13</w:t>
-      </w:r>
-    </w:p>
-    <w:p>
-      <w:pPr>
-        <w:pStyle w:val="ListBullet"/>
-        <w:spacing w:after="60"/>
-      </w:pPr>
-      <w:r>
-        <w:rPr>
-          <w:rFonts w:ascii="Times New Roman" w:hAnsi="Times New Roman" w:cs="Times New Roman"/>
-          <w:b w:val="0"/>
-          <w:i w:val="0"/>
-          <w:sz w:val="22"/>
-        </w:rPr>
-        <w:t>9.1 Joint Training Imperative — 13</w:t>
-      </w:r>
-    </w:p>
-    <w:p>
-      <w:pPr>
-        <w:pStyle w:val="ListBullet"/>
-        <w:spacing w:after="60"/>
-      </w:pPr>
-      <w:r>
-        <w:rPr>
-          <w:rFonts w:ascii="Times New Roman" w:hAnsi="Times New Roman" w:cs="Times New Roman"/>
-          <w:b w:val="0"/>
-          <w:i w:val="0"/>
-          <w:sz w:val="22"/>
-        </w:rPr>
-        <w:t>9.2 Training for Phase 2 Operations — 13</w:t>
-      </w:r>
-    </w:p>
-    <w:p>
-      <w:pPr>
-        <w:pStyle w:val="ListBullet"/>
-        <w:spacing w:after="60"/>
-      </w:pPr>
-      <w:r>
-        <w:rPr>
-          <w:rFonts w:ascii="Times New Roman" w:hAnsi="Times New Roman" w:cs="Times New Roman"/>
-          <w:b w:val="0"/>
-          <w:i w:val="0"/>
-          <w:sz w:val="22"/>
-        </w:rPr>
-        <w:t>9.3 First-On-Scene Leadership Training — 13</w:t>
-      </w:r>
-    </w:p>
-    <w:p>
-      <w:pPr>
-        <w:pStyle w:val="ListBullet"/>
-        <w:spacing w:after="60"/>
-      </w:pPr>
-      <w:r>
-        <w:rPr>
-          <w:rFonts w:ascii="Times New Roman" w:hAnsi="Times New Roman" w:cs="Times New Roman"/>
-          <w:b w:val="0"/>
-          <w:i w:val="0"/>
-          <w:sz w:val="22"/>
-        </w:rPr>
-        <w:t>9.4 Pre-Incident Planning — 14</w:t>
-      </w:r>
-    </w:p>
-    <w:p>
-      <w:pPr>
-        <w:pStyle w:val="ListBullet"/>
-        <w:spacing w:after="60"/>
-      </w:pPr>
-      <w:r>
-        <w:rPr>
-          <w:rFonts w:ascii="Times New Roman" w:hAnsi="Times New Roman" w:cs="Times New Roman"/>
-          <w:b w:val="0"/>
-          <w:i w:val="0"/>
-          <w:sz w:val="22"/>
-        </w:rPr>
-        <w:t>9.5 Empowerment and Support — 14</w:t>
-      </w:r>
-    </w:p>
-    <w:p>
-      <w:pPr>
-        <w:pStyle w:val="ListBullet"/>
-        <w:spacing w:after="60"/>
-      </w:pPr>
-      <w:r>
-        <w:rPr>
-          <w:rFonts w:ascii="Times New Roman" w:hAnsi="Times New Roman" w:cs="Times New Roman"/>
-          <w:b w:val="0"/>
-          <w:i w:val="0"/>
-          <w:sz w:val="22"/>
-        </w:rPr>
-        <w:t>9.6 Sample Size-Up Components — 14</w:t>
-      </w:r>
-    </w:p>
-    <w:p>
-      <w:pPr>
-        <w:pStyle w:val="ListNumber"/>
-        <w:spacing w:after="60"/>
-      </w:pPr>
-      <w:r>
-        <w:rPr>
-          <w:rFonts w:ascii="Times New Roman" w:hAnsi="Times New Roman" w:cs="Times New Roman"/>
-          <w:b w:val="0"/>
-          <w:i w:val="0"/>
-          <w:sz w:val="22"/>
-        </w:rPr>
-        <w:t>MUTUAL AID AND RESOURCE MANAGEMENT — 14</w:t>
-      </w:r>
-    </w:p>
-    <w:p>
-      <w:pPr>
-        <w:pStyle w:val="ListBullet"/>
-        <w:spacing w:after="60"/>
-      </w:pPr>
-      <w:r>
-        <w:rPr>
-          <w:rFonts w:ascii="Times New Roman" w:hAnsi="Times New Roman" w:cs="Times New Roman"/>
-          <w:b w:val="0"/>
-          <w:i w:val="0"/>
-          <w:sz w:val="22"/>
-        </w:rPr>
-        <w:t>10.1 Managing Incoming Resources — 14</w:t>
-      </w:r>
-    </w:p>
-    <w:p>
-      <w:pPr>
-        <w:pStyle w:val="ListBullet"/>
-        <w:spacing w:after="60"/>
-      </w:pPr>
-      <w:r>
-        <w:rPr>
-          <w:rFonts w:ascii="Times New Roman" w:hAnsi="Times New Roman" w:cs="Times New Roman"/>
-          <w:b w:val="0"/>
-          <w:i w:val="0"/>
-          <w:sz w:val="22"/>
-        </w:rPr>
-        <w:t>10.2 Mutual Aid Integration — 15</w:t>
-      </w:r>
-    </w:p>
-    <w:p>
-      <w:pPr>
-        <w:pStyle w:val="ListBullet"/>
-        <w:spacing w:after="60"/>
-      </w:pPr>
-      <w:r>
-        <w:rPr>
-          <w:rFonts w:ascii="Times New Roman" w:hAnsi="Times New Roman" w:cs="Times New Roman"/>
-          <w:b w:val="0"/>
-          <w:i w:val="0"/>
-          <w:sz w:val="22"/>
-        </w:rPr>
-        <w:t>10.3 Resource Tracking — 15</w:t>
-      </w:r>
-    </w:p>
-    <w:p>
-      <w:pPr>
-        <w:pStyle w:val="ListBullet"/>
-        <w:spacing w:after="60"/>
-      </w:pPr>
-      <w:r>
-        <w:rPr>
-          <w:rFonts w:ascii="Times New Roman" w:hAnsi="Times New Roman" w:cs="Times New Roman"/>
-          <w:b w:val="0"/>
-          <w:i w:val="0"/>
-          <w:sz w:val="22"/>
-        </w:rPr>
-        <w:t>10.4 Preventing Freelancing/Self-deployment and Overlap — 15</w:t>
-      </w:r>
-    </w:p>
-    <w:p>
-      <w:pPr>
-        <w:pStyle w:val="ListNumber"/>
-        <w:spacing w:after="60"/>
-      </w:pPr>
-      <w:r>
-        <w:rPr>
-          <w:rFonts w:ascii="Times New Roman" w:hAnsi="Times New Roman" w:cs="Times New Roman"/>
-          <w:b w:val="0"/>
-          <w:i w:val="0"/>
-          <w:sz w:val="22"/>
-        </w:rPr>
-        <w:t>OPERATIONAL QUICK-REFERENCE — 15</w:t>
-      </w:r>
-    </w:p>
-    <w:p>
-      <w:pPr>
-        <w:pStyle w:val="ListBullet"/>
-        <w:spacing w:after="60"/>
-      </w:pPr>
-      <w:r>
-        <w:rPr>
-          <w:rFonts w:ascii="Times New Roman" w:hAnsi="Times New Roman" w:cs="Times New Roman"/>
-          <w:b w:val="0"/>
-          <w:i w:val="0"/>
-          <w:sz w:val="22"/>
-        </w:rPr>
-        <w:t>11.1 First Officer on Scene Checklist — 15</w:t>
-      </w:r>
-    </w:p>
-    <w:p>
-      <w:pPr>
-        <w:pStyle w:val="ListBullet"/>
-        <w:spacing w:after="60"/>
-      </w:pPr>
-      <w:r>
-        <w:rPr>
-          <w:rFonts w:ascii="Times New Roman" w:hAnsi="Times New Roman" w:cs="Times New Roman"/>
-          <w:b w:val="0"/>
-          <w:i w:val="0"/>
-          <w:sz w:val="22"/>
-        </w:rPr>
-        <w:t>11.2 Supervisor Arrival Checklist — 15</w:t>
-      </w:r>
-    </w:p>
-    <w:p>
-      <w:pPr>
-        <w:pStyle w:val="ListBullet"/>
-        <w:spacing w:after="60"/>
-      </w:pPr>
-      <w:r>
-        <w:rPr>
-          <w:rFonts w:ascii="Times New Roman" w:hAnsi="Times New Roman" w:cs="Times New Roman"/>
-          <w:b w:val="0"/>
-          <w:i w:val="0"/>
-          <w:sz w:val="22"/>
-        </w:rPr>
-        <w:t>11.3 Unified Command Formation Checklist — 16</w:t>
-      </w:r>
-    </w:p>
-    <w:p>
-      <w:pPr>
-        <w:pStyle w:val="ListBullet"/>
-        <w:spacing w:after="60"/>
-      </w:pPr>
-      <w:r>
-        <w:rPr>
-          <w:rFonts w:ascii="Times New Roman" w:hAnsi="Times New Roman" w:cs="Times New Roman"/>
-          <w:b w:val="0"/>
-          <w:i w:val="0"/>
-          <w:sz w:val="22"/>
-        </w:rPr>
-        <w:t>11.4 RTF Deployment Checklist — 16</w:t>
-      </w:r>
-    </w:p>
-    <w:p>
-      <w:pPr>
-        <w:pStyle w:val="ListBullet"/>
-        <w:spacing w:after="60"/>
-      </w:pPr>
-      <w:r>
-        <w:rPr>
-          <w:rFonts w:ascii="Times New Roman" w:hAnsi="Times New Roman" w:cs="Times New Roman"/>
-          <w:b w:val="0"/>
-          <w:i w:val="0"/>
-          <w:sz w:val="22"/>
-        </w:rPr>
-        <w:t>11.5 Phase Transition Decision Points — 16</w:t>
-      </w:r>
-    </w:p>
-    <w:p>
-      <w:pPr>
-        <w:pStyle w:val="ListNumber"/>
-        <w:spacing w:after="60"/>
-      </w:pPr>
-      <w:r>
-        <w:rPr>
-          <w:rFonts w:ascii="Times New Roman" w:hAnsi="Times New Roman" w:cs="Times New Roman"/>
-          <w:b w:val="0"/>
-          <w:i w:val="0"/>
-          <w:sz w:val="22"/>
-        </w:rPr>
-        <w:t>KEY DEFINITIONS — 16</w:t>
-      </w:r>
-    </w:p>
-    <w:p>
-      <w:pPr>
-        <w:pStyle w:val="ListNumber"/>
-        <w:spacing w:after="60"/>
-      </w:pPr>
-      <w:r>
-        <w:rPr>
-          <w:rFonts w:ascii="Times New Roman" w:hAnsi="Times New Roman" w:cs="Times New Roman"/>
-          <w:b w:val="0"/>
-          <w:i w:val="0"/>
-          <w:sz w:val="22"/>
-        </w:rPr>
-        <w:t>REFERENCES — 18</w:t>
+          <w:i/>
+          <w:sz w:val="22"/>
+        </w:rPr>
+        <w:t>Right-click and choose Update Field to populate the Table of Contents.</w:t>
+      </w:r>
+      <w:r>
+        <w:fldChar w:fldCharType="end"/>
       </w:r>
     </w:p>
     <w:p>

</xml_diff>